<commit_message>
Label data flows, treat governance as per-hand-off considerations, mark access rule Proposed
Arrows now name the data that moves between stages. Authentication,
validation, monitoring, mitigation and alarm are presented as questions
asked at every hand-off, with a grid of how each applies. The CMAC
own-requests rule is marked Proposed pending confirmed permissions.

Co-Authored-By: Claude Opus 5.5 <noreply@anthropic.com>
Claude-Session: https://claude.ai/code/session_01XD5hCTym2561nrmEJXnbUU
</commit_message>
<xml_diff>
--- a/MDPM 830/Data Pipeline/Ade_Deliverables_Pipeline_Stages_and_Data_Ownership.docx
+++ b/MDPM 830/Data Pipeline/Ade_Deliverables_Pipeline_Stages_and_Data_Ownership.docx
@@ -437,7 +437,7 @@
                 <w:b w:val="0"/>
                 <w:sz w:val="19"/>
               </w:rPr>
-              <w:t>Same frame, Part C; section 4 below</w:t>
+              <w:t>Same frame, Part C; section 5 below</w:t>
             </w:r>
           </w:p>
         </w:tc>
@@ -591,7 +591,7 @@
                 <w:b w:val="0"/>
                 <w:sz w:val="19"/>
               </w:rPr>
-              <w:t>Controls on the hand-offs (A, V, F, M, S)</w:t>
+              <w:t>Governance at every hand-off: authentication, validation, monitoring, mitigation, alarm</w:t>
             </w:r>
           </w:p>
         </w:tc>
@@ -609,7 +609,7 @@
                 <w:b w:val="0"/>
                 <w:sz w:val="19"/>
               </w:rPr>
-              <w:t>Session Four: connectors carry the controls</w:t>
+              <w:t>Session Four: at every hand-off, ask all five</w:t>
             </w:r>
           </w:p>
         </w:tc>
@@ -627,7 +627,7 @@
                 <w:b w:val="0"/>
                 <w:sz w:val="19"/>
               </w:rPr>
-              <w:t>Same frame, labelled connectors</w:t>
+              <w:t>Miro Part G; section 4 below</w:t>
             </w:r>
           </w:p>
         </w:tc>
@@ -645,7 +645,7 @@
                 <w:b w:val="0"/>
                 <w:sz w:val="19"/>
               </w:rPr>
-              <w:t>Proposed</w:t>
+              <w:t>Proposed where not in our requirements</w:t>
             </w:r>
           </w:p>
         </w:tc>
@@ -722,7 +722,7 @@
                 <w:b w:val="0"/>
                 <w:sz w:val="19"/>
               </w:rPr>
-              <w:t>Same frame, plus "Working 2: Pipeline Mapping (Ade)"</w:t>
+              <w:t>Same frame; the earlier draft frame is integrated as Part H</w:t>
             </w:r>
           </w:p>
         </w:tc>
@@ -912,7 +912,7 @@
                 <w:b w:val="0"/>
                 <w:sz w:val="19"/>
               </w:rPr>
-              <w:t>Deck slides 5 and 6; section 6 below</w:t>
+              <w:t>Deck slides 5 and 6; section 7 below</w:t>
             </w:r>
           </w:p>
         </w:tc>
@@ -1007,7 +1007,7 @@
                 <w:b w:val="0"/>
                 <w:sz w:val="19"/>
               </w:rPr>
-              <w:t>Section 7 below</w:t>
+              <w:t>Section 8 below</w:t>
             </w:r>
           </w:p>
         </w:tc>
@@ -1377,7 +1377,7 @@
                 <w:b/>
                 <w:sz w:val="17"/>
               </w:rPr>
-              <w:t>Control on the hand-off</w:t>
+              <w:t>Governance at the hand-off (main consideration; all five apply, section 4)</w:t>
             </w:r>
           </w:p>
         </w:tc>
@@ -1603,14 +1603,39 @@
                 <w:b/>
                 <w:sz w:val="17"/>
               </w:rPr>
-              <w:t>A, authenticate</w:t>
+              <w:t>Moves on:</w:t>
             </w:r>
             <w:r>
               <w:rPr>
                 <w:b w:val="0"/>
                 <w:sz w:val="17"/>
               </w:rPr>
-              <w:t xml:space="preserve"> (into Collect): only an authorized requester may submit for their ministry. Proposed</w:t>
+              <w:t xml:space="preserve"> the need (item, quantity, location, reason)</w:t>
+            </w:r>
+          </w:p>
+          <w:p>
+            <w:pPr>
+              <w:spacing w:after="20"/>
+            </w:pPr>
+            <w:r>
+              <w:rPr>
+                <w:b w:val="0"/>
+                <w:sz w:val="17"/>
+              </w:rPr>
+            </w:r>
+            <w:r>
+              <w:rPr>
+                <w:b/>
+                <w:sz w:val="17"/>
+              </w:rPr>
+              <w:t>Main: authentication</w:t>
+            </w:r>
+            <w:r>
+              <w:rPr>
+                <w:b w:val="0"/>
+                <w:sz w:val="17"/>
+              </w:rPr>
+              <w:t>, only an authorized requester may submit for their ministry (FR-25)</w:t>
             </w:r>
           </w:p>
         </w:tc>
@@ -1985,14 +2010,39 @@
                 <w:b/>
                 <w:sz w:val="17"/>
               </w:rPr>
-              <w:t>V, validate</w:t>
+              <w:t>Moves on:</w:t>
             </w:r>
             <w:r>
               <w:rPr>
                 <w:b w:val="0"/>
                 <w:sz w:val="17"/>
               </w:rPr>
-              <w:t xml:space="preserve"> (into Keep and Shape): required fields checked against the request checklist; an incomplete request goes back to the requester. Proposed</w:t>
+              <w:t xml:space="preserve"> the submitted request and attachments (bronze)</w:t>
+            </w:r>
+          </w:p>
+          <w:p>
+            <w:pPr>
+              <w:spacing w:after="20"/>
+            </w:pPr>
+            <w:r>
+              <w:rPr>
+                <w:b w:val="0"/>
+                <w:sz w:val="17"/>
+              </w:rPr>
+            </w:r>
+            <w:r>
+              <w:rPr>
+                <w:b/>
+                <w:sz w:val="17"/>
+              </w:rPr>
+              <w:t>Main: validation</w:t>
+            </w:r>
+            <w:r>
+              <w:rPr>
+                <w:b w:val="0"/>
+                <w:sz w:val="17"/>
+              </w:rPr>
+              <w:t>, required fields and attachments checked; an incomplete request goes back to the requester (FR-07)</w:t>
             </w:r>
           </w:p>
         </w:tc>
@@ -2138,7 +2188,7 @@
                 <w:b w:val="0"/>
                 <w:sz w:val="17"/>
               </w:rPr>
-              <w:t>Keep the request as submitted (bronze). Build one consistent version (silver): updates linked, status standardized, duplicates checked. Six rules in section 4</w:t>
+              <w:t>Keep the request as submitted (bronze). Build one consistent version (silver): updates linked, status standardized, duplicates checked. Six rules in section 5</w:t>
             </w:r>
           </w:p>
         </w:tc>
@@ -2218,14 +2268,39 @@
                 <w:b/>
                 <w:sz w:val="17"/>
               </w:rPr>
-              <w:t>F, monitor</w:t>
+              <w:t>Moves on:</w:t>
             </w:r>
             <w:r>
               <w:rPr>
                 <w:b w:val="0"/>
                 <w:sz w:val="17"/>
               </w:rPr>
-              <w:t xml:space="preserve"> (into Store): every stage change carries a time, so a request that stops moving is visible. Proposed</w:t>
+              <w:t xml:space="preserve"> the clean, linked request (silver)</w:t>
+            </w:r>
+          </w:p>
+          <w:p>
+            <w:pPr>
+              <w:spacing w:after="20"/>
+            </w:pPr>
+            <w:r>
+              <w:rPr>
+                <w:b w:val="0"/>
+                <w:sz w:val="17"/>
+              </w:rPr>
+            </w:r>
+            <w:r>
+              <w:rPr>
+                <w:b/>
+                <w:sz w:val="17"/>
+              </w:rPr>
+              <w:t>Main: monitoring</w:t>
+            </w:r>
+            <w:r>
+              <w:rPr>
+                <w:b w:val="0"/>
+                <w:sz w:val="17"/>
+              </w:rPr>
+              <w:t>, every stage change carries a time, so a request that stops moving is visible. Proposed</w:t>
             </w:r>
           </w:p>
         </w:tc>
@@ -2451,14 +2526,39 @@
                 <w:b/>
                 <w:sz w:val="17"/>
               </w:rPr>
-              <w:t>M, mitigate</w:t>
+              <w:t>Moves on:</w:t>
             </w:r>
             <w:r>
               <w:rPr>
                 <w:b w:val="0"/>
                 <w:sz w:val="17"/>
               </w:rPr>
-              <w:t xml:space="preserve"> (into Use): a failed update or upload is held and retried, and the user is told. Proposed</w:t>
+              <w:t xml:space="preserve"> the request record with its history</w:t>
+            </w:r>
+          </w:p>
+          <w:p>
+            <w:pPr>
+              <w:spacing w:after="20"/>
+            </w:pPr>
+            <w:r>
+              <w:rPr>
+                <w:b w:val="0"/>
+                <w:sz w:val="17"/>
+              </w:rPr>
+            </w:r>
+            <w:r>
+              <w:rPr>
+                <w:b/>
+                <w:sz w:val="17"/>
+              </w:rPr>
+              <w:t>Main: mitigation</w:t>
+            </w:r>
+            <w:r>
+              <w:rPr>
+                <w:b w:val="0"/>
+                <w:sz w:val="17"/>
+              </w:rPr>
+              <w:t>, a failed update or upload is retried and the user is told. Proposed</w:t>
             </w:r>
           </w:p>
         </w:tc>
@@ -2635,7 +2735,7 @@
                 <w:b w:val="0"/>
                 <w:sz w:val="17"/>
               </w:rPr>
-              <w:t xml:space="preserve"> a CMAC sees only their own requests</w:t>
+              <w:t xml:space="preserve"> Proposed: a CMAC sees only their own requests. Exact permissions to confirm with Cohen</w:t>
             </w:r>
           </w:p>
           <w:p>
@@ -2684,14 +2784,39 @@
                 <w:b/>
                 <w:sz w:val="17"/>
               </w:rPr>
-              <w:t>S, alarm</w:t>
+              <w:t>Moves on:</w:t>
             </w:r>
             <w:r>
               <w:rPr>
                 <w:b w:val="0"/>
                 <w:sz w:val="17"/>
               </w:rPr>
-              <w:t xml:space="preserve"> (into the sinks): an unanswered Action Required notifies the requester; a shared proposal notifies the coordinator. Email preferred by the client. Proposed</w:t>
+              <w:t xml:space="preserve"> status, events and aggregates (gold)</w:t>
+            </w:r>
+          </w:p>
+          <w:p>
+            <w:pPr>
+              <w:spacing w:after="20"/>
+            </w:pPr>
+            <w:r>
+              <w:rPr>
+                <w:b w:val="0"/>
+                <w:sz w:val="17"/>
+              </w:rPr>
+            </w:r>
+            <w:r>
+              <w:rPr>
+                <w:b/>
+                <w:sz w:val="17"/>
+              </w:rPr>
+              <w:t>Main: alarm</w:t>
+            </w:r>
+            <w:r>
+              <w:rPr>
+                <w:b w:val="0"/>
+                <w:sz w:val="17"/>
+              </w:rPr>
+              <w:t>, an unanswered Action Required notifies the requester; email preferred by the client. Proposed</w:t>
             </w:r>
           </w:p>
         </w:tc>
@@ -2868,7 +2993,7 @@
                 <w:b/>
                 <w:sz w:val="19"/>
               </w:rPr>
-              <w:t>Control into the next hop</w:t>
+              <w:t>Passed to the next hop</w:t>
             </w:r>
           </w:p>
         </w:tc>
@@ -2963,7 +3088,7 @@
                 <w:b w:val="0"/>
                 <w:sz w:val="19"/>
               </w:rPr>
-              <w:t>A, authenticate</w:t>
+              <w:t>Need: item, quantity, location, reason</w:t>
             </w:r>
           </w:p>
         </w:tc>
@@ -3058,7 +3183,7 @@
                 <w:b w:val="0"/>
                 <w:sz w:val="19"/>
               </w:rPr>
-              <w:t>V, validate</w:t>
+              <w:t>Submitted request and attachments (bronze)</w:t>
             </w:r>
           </w:p>
         </w:tc>
@@ -3153,7 +3278,7 @@
                 <w:b w:val="0"/>
                 <w:sz w:val="19"/>
               </w:rPr>
-              <w:t>F, monitor</w:t>
+              <w:t>Clean, linked request (silver)</w:t>
             </w:r>
           </w:p>
         </w:tc>
@@ -3248,7 +3373,7 @@
                 <w:b w:val="0"/>
                 <w:sz w:val="19"/>
               </w:rPr>
-              <w:t>M, mitigate</w:t>
+              <w:t>Request record with history</w:t>
             </w:r>
           </w:p>
         </w:tc>
@@ -3343,7 +3468,7 @@
                 <w:b w:val="0"/>
                 <w:sz w:val="19"/>
               </w:rPr>
-              <w:t>S, alarm, into the sinks</w:t>
+              <w:t>Status, events and aggregates (gold) to the sinks</w:t>
             </w:r>
           </w:p>
         </w:tc>
@@ -4557,7 +4682,7 @@
                 <w:b w:val="0"/>
                 <w:sz w:val="18"/>
               </w:rPr>
-              <w:t>Product (access by ministry); reports</w:t>
+              <w:t>Product (access rule Proposed); reports</w:t>
             </w:r>
           </w:p>
         </w:tc>
@@ -5369,7 +5494,782 @@
           <w:b/>
           <w:sz w:val="26"/>
         </w:rPr>
-        <w:t>4. Cleaning requirements: what "clean" means for PRISM Furniture Request</w:t>
+        <w:t>4. Governance at every hand-off</w:t>
+      </w:r>
+    </w:p>
+    <w:p>
+      <w:r>
+        <w:rPr>
+          <w:b w:val="0"/>
+          <w:i/>
+          <w:sz w:val="20"/>
+        </w:rPr>
+        <w:t>Authentication, validation, monitoring, mitigation and alarms are considerations at every hand-off (Session Four: at every hand-off, ask all five), not one control per connection. The grid shows how each applies; letters on the stages mark the main consideration only. Cells marked Proposed, to confirm or to define need team or client confirmation.</w:t>
+      </w:r>
+    </w:p>
+    <w:tbl>
+      <w:tblPr>
+        <w:tblStyle w:val="TableGrid"/>
+        <w:tblW w:type="auto" w:w="0"/>
+        <w:tblLook w:firstColumn="1" w:firstRow="1" w:lastColumn="0" w:lastRow="0" w:noHBand="0" w:noVBand="1" w:val="04A0"/>
+      </w:tblPr>
+      <w:tblGrid>
+        <w:gridCol w:w="2304"/>
+        <w:gridCol w:w="2304"/>
+        <w:gridCol w:w="2304"/>
+        <w:gridCol w:w="2304"/>
+        <w:gridCol w:w="2304"/>
+        <w:gridCol w:w="2304"/>
+      </w:tblGrid>
+      <w:tr>
+        <w:trPr>
+          <w:cantSplit/>
+          <w:tblHeader/>
+        </w:trPr>
+        <w:tc>
+          <w:tcPr>
+            <w:tcW w:type="dxa" w:w="2304"/>
+            <w:shd w:val="clear" w:fill="D9D9D9"/>
+          </w:tcPr>
+          <w:p>
+            <w:r/>
+            <w:r>
+              <w:rPr>
+                <w:b/>
+                <w:sz w:val="17"/>
+              </w:rPr>
+              <w:t>Hand-off and what moves</w:t>
+            </w:r>
+          </w:p>
+        </w:tc>
+        <w:tc>
+          <w:tcPr>
+            <w:tcW w:type="dxa" w:w="2304"/>
+            <w:shd w:val="clear" w:fill="D9D9D9"/>
+          </w:tcPr>
+          <w:p>
+            <w:r/>
+            <w:r>
+              <w:rPr>
+                <w:b/>
+                <w:sz w:val="17"/>
+              </w:rPr>
+              <w:t>Authenticate: who may move it?</w:t>
+            </w:r>
+          </w:p>
+        </w:tc>
+        <w:tc>
+          <w:tcPr>
+            <w:tcW w:type="dxa" w:w="2304"/>
+            <w:shd w:val="clear" w:fill="D9D9D9"/>
+          </w:tcPr>
+          <w:p>
+            <w:r/>
+            <w:r>
+              <w:rPr>
+                <w:b/>
+                <w:sz w:val="17"/>
+              </w:rPr>
+              <w:t>Validate: is it acceptable?</w:t>
+            </w:r>
+          </w:p>
+        </w:tc>
+        <w:tc>
+          <w:tcPr>
+            <w:tcW w:type="dxa" w:w="2304"/>
+            <w:shd w:val="clear" w:fill="D9D9D9"/>
+          </w:tcPr>
+          <w:p>
+            <w:r/>
+            <w:r>
+              <w:rPr>
+                <w:b/>
+                <w:sz w:val="17"/>
+              </w:rPr>
+              <w:t>Monitor: would we know it stopped?</w:t>
+            </w:r>
+          </w:p>
+        </w:tc>
+        <w:tc>
+          <w:tcPr>
+            <w:tcW w:type="dxa" w:w="2304"/>
+            <w:shd w:val="clear" w:fill="D9D9D9"/>
+          </w:tcPr>
+          <w:p>
+            <w:r/>
+            <w:r>
+              <w:rPr>
+                <w:b/>
+                <w:sz w:val="17"/>
+              </w:rPr>
+              <w:t>Mitigate: what if it fails?</w:t>
+            </w:r>
+          </w:p>
+        </w:tc>
+        <w:tc>
+          <w:tcPr>
+            <w:tcW w:type="dxa" w:w="2304"/>
+            <w:shd w:val="clear" w:fill="D9D9D9"/>
+          </w:tcPr>
+          <w:p>
+            <w:r/>
+            <w:r>
+              <w:rPr>
+                <w:b/>
+                <w:sz w:val="17"/>
+              </w:rPr>
+              <w:t>Alarm: who is told?</w:t>
+            </w:r>
+          </w:p>
+        </w:tc>
+      </w:tr>
+      <w:tr>
+        <w:trPr>
+          <w:cantSplit/>
+        </w:trPr>
+        <w:tc>
+          <w:tcPr>
+            <w:tcW w:type="dxa" w:w="2304"/>
+            <w:shd w:val="clear" w:fill="DCE6F2"/>
+          </w:tcPr>
+          <w:p>
+            <w:pPr>
+              <w:spacing w:after="20"/>
+            </w:pPr>
+            <w:r/>
+            <w:r>
+              <w:rPr>
+                <w:b/>
+                <w:sz w:val="17"/>
+              </w:rPr>
+              <w:t>Generate to Collect</w:t>
+            </w:r>
+          </w:p>
+          <w:p>
+            <w:pPr>
+              <w:spacing w:after="20"/>
+            </w:pPr>
+            <w:r>
+              <w:rPr>
+                <w:b/>
+                <w:sz w:val="17"/>
+              </w:rPr>
+              <w:t>need reaches the form</w:t>
+            </w:r>
+          </w:p>
+        </w:tc>
+        <w:tc>
+          <w:tcPr>
+            <w:tcW w:type="dxa" w:w="2304"/>
+          </w:tcPr>
+          <w:p>
+            <w:pPr>
+              <w:spacing w:after="20"/>
+            </w:pPr>
+            <w:r/>
+            <w:r>
+              <w:rPr>
+                <w:b w:val="0"/>
+                <w:sz w:val="17"/>
+              </w:rPr>
+              <w:t>Only an authorized requester may submit for their ministry (FR-25)</w:t>
+            </w:r>
+          </w:p>
+        </w:tc>
+        <w:tc>
+          <w:tcPr>
+            <w:tcW w:type="dxa" w:w="2304"/>
+          </w:tcPr>
+          <w:p>
+            <w:pPr>
+              <w:spacing w:after="20"/>
+            </w:pPr>
+            <w:r/>
+            <w:r>
+              <w:rPr>
+                <w:b w:val="0"/>
+                <w:sz w:val="17"/>
+              </w:rPr>
+              <w:t>Required fields and type-specific attachments checked in the form (FR-03, FR-07)</w:t>
+            </w:r>
+          </w:p>
+        </w:tc>
+        <w:tc>
+          <w:tcPr>
+            <w:tcW w:type="dxa" w:w="2304"/>
+          </w:tcPr>
+          <w:p>
+            <w:pPr>
+              <w:spacing w:after="20"/>
+            </w:pPr>
+            <w:r/>
+            <w:r>
+              <w:rPr>
+                <w:b w:val="0"/>
+                <w:sz w:val="17"/>
+              </w:rPr>
+              <w:t>Needs kept in email, Teams or phone stay invisible (gap G1); how this is noticed: to confirm</w:t>
+            </w:r>
+          </w:p>
+        </w:tc>
+        <w:tc>
+          <w:tcPr>
+            <w:tcW w:type="dxa" w:w="2304"/>
+          </w:tcPr>
+          <w:p>
+            <w:pPr>
+              <w:spacing w:after="20"/>
+            </w:pPr>
+            <w:r/>
+            <w:r>
+              <w:rPr>
+                <w:b w:val="0"/>
+                <w:sz w:val="17"/>
+              </w:rPr>
+              <w:t>Draft saved and resumable (FR-05)</w:t>
+            </w:r>
+          </w:p>
+        </w:tc>
+        <w:tc>
+          <w:tcPr>
+            <w:tcW w:type="dxa" w:w="2304"/>
+          </w:tcPr>
+          <w:p>
+            <w:pPr>
+              <w:spacing w:after="20"/>
+            </w:pPr>
+            <w:r/>
+            <w:r>
+              <w:rPr>
+                <w:b w:val="0"/>
+                <w:sz w:val="17"/>
+              </w:rPr>
+              <w:t>Submission confirmed to the requester (FR-09)</w:t>
+            </w:r>
+          </w:p>
+        </w:tc>
+      </w:tr>
+      <w:tr>
+        <w:trPr>
+          <w:cantSplit/>
+        </w:trPr>
+        <w:tc>
+          <w:tcPr>
+            <w:tcW w:type="dxa" w:w="2304"/>
+            <w:shd w:val="clear" w:fill="DCE6F2"/>
+          </w:tcPr>
+          <w:p>
+            <w:pPr>
+              <w:spacing w:after="20"/>
+            </w:pPr>
+            <w:r/>
+            <w:r>
+              <w:rPr>
+                <w:b/>
+                <w:sz w:val="17"/>
+              </w:rPr>
+              <w:t>Collect to Keep and Shape</w:t>
+            </w:r>
+          </w:p>
+          <w:p>
+            <w:pPr>
+              <w:spacing w:after="20"/>
+            </w:pPr>
+            <w:r>
+              <w:rPr>
+                <w:b/>
+                <w:sz w:val="17"/>
+              </w:rPr>
+              <w:t>submitted request to review</w:t>
+            </w:r>
+          </w:p>
+        </w:tc>
+        <w:tc>
+          <w:tcPr>
+            <w:tcW w:type="dxa" w:w="2304"/>
+          </w:tcPr>
+          <w:p>
+            <w:pPr>
+              <w:spacing w:after="20"/>
+            </w:pPr>
+            <w:r/>
+            <w:r>
+              <w:rPr>
+                <w:b w:val="0"/>
+                <w:sz w:val="17"/>
+              </w:rPr>
+              <w:t>Only Infrastructure staff in a reviewing role may review (roles to confirm)</w:t>
+            </w:r>
+          </w:p>
+        </w:tc>
+        <w:tc>
+          <w:tcPr>
+            <w:tcW w:type="dxa" w:w="2304"/>
+          </w:tcPr>
+          <w:p>
+            <w:pPr>
+              <w:spacing w:after="20"/>
+            </w:pPr>
+            <w:r/>
+            <w:r>
+              <w:rPr>
+                <w:b w:val="0"/>
+                <w:sz w:val="17"/>
+              </w:rPr>
+              <w:t>Completeness checked at review; an incomplete request goes back to the CMAC (Scenario 7)</w:t>
+            </w:r>
+          </w:p>
+        </w:tc>
+        <w:tc>
+          <w:tcPr>
+            <w:tcW w:type="dxa" w:w="2304"/>
+          </w:tcPr>
+          <w:p>
+            <w:pPr>
+              <w:spacing w:after="20"/>
+            </w:pPr>
+            <w:r/>
+            <w:r>
+              <w:rPr>
+                <w:b w:val="0"/>
+                <w:sz w:val="17"/>
+              </w:rPr>
+              <w:t>Time from submission to first assignment recorded</w:t>
+            </w:r>
+          </w:p>
+        </w:tc>
+        <w:tc>
+          <w:tcPr>
+            <w:tcW w:type="dxa" w:w="2304"/>
+          </w:tcPr>
+          <w:p>
+            <w:pPr>
+              <w:spacing w:after="20"/>
+            </w:pPr>
+            <w:r/>
+            <w:r>
+              <w:rPr>
+                <w:b w:val="0"/>
+                <w:sz w:val="17"/>
+              </w:rPr>
+              <w:t>Original kept as submitted (bronze)</w:t>
+            </w:r>
+          </w:p>
+        </w:tc>
+        <w:tc>
+          <w:tcPr>
+            <w:tcW w:type="dxa" w:w="2304"/>
+          </w:tcPr>
+          <w:p>
+            <w:pPr>
+              <w:spacing w:after="20"/>
+            </w:pPr>
+            <w:r/>
+            <w:r>
+              <w:rPr>
+                <w:b w:val="0"/>
+                <w:sz w:val="17"/>
+              </w:rPr>
+              <w:t>CMAC told when action is required</w:t>
+            </w:r>
+          </w:p>
+        </w:tc>
+      </w:tr>
+      <w:tr>
+        <w:trPr>
+          <w:cantSplit/>
+        </w:trPr>
+        <w:tc>
+          <w:tcPr>
+            <w:tcW w:type="dxa" w:w="2304"/>
+            <w:shd w:val="clear" w:fill="DCE6F2"/>
+          </w:tcPr>
+          <w:p>
+            <w:pPr>
+              <w:spacing w:after="20"/>
+            </w:pPr>
+            <w:r/>
+            <w:r>
+              <w:rPr>
+                <w:b/>
+                <w:sz w:val="17"/>
+              </w:rPr>
+              <w:t>Keep and Shape to Store</w:t>
+            </w:r>
+          </w:p>
+          <w:p>
+            <w:pPr>
+              <w:spacing w:after="20"/>
+            </w:pPr>
+            <w:r>
+              <w:rPr>
+                <w:b/>
+                <w:sz w:val="17"/>
+              </w:rPr>
+              <w:t>clean record written</w:t>
+            </w:r>
+          </w:p>
+        </w:tc>
+        <w:tc>
+          <w:tcPr>
+            <w:tcW w:type="dxa" w:w="2304"/>
+          </w:tcPr>
+          <w:p>
+            <w:pPr>
+              <w:spacing w:after="20"/>
+            </w:pPr>
+            <w:r/>
+            <w:r>
+              <w:rPr>
+                <w:b w:val="0"/>
+                <w:sz w:val="17"/>
+              </w:rPr>
+              <w:t>Only coordinators may change status or merge duplicates (Proposed)</w:t>
+            </w:r>
+          </w:p>
+        </w:tc>
+        <w:tc>
+          <w:tcPr>
+            <w:tcW w:type="dxa" w:w="2304"/>
+          </w:tcPr>
+          <w:p>
+            <w:pPr>
+              <w:spacing w:after="20"/>
+            </w:pPr>
+            <w:r/>
+            <w:r>
+              <w:rPr>
+                <w:b w:val="0"/>
+                <w:sz w:val="17"/>
+              </w:rPr>
+              <w:t>Standard status list; duplicate check on a match key (key to define)</w:t>
+            </w:r>
+          </w:p>
+        </w:tc>
+        <w:tc>
+          <w:tcPr>
+            <w:tcW w:type="dxa" w:w="2304"/>
+          </w:tcPr>
+          <w:p>
+            <w:pPr>
+              <w:spacing w:after="20"/>
+            </w:pPr>
+            <w:r/>
+            <w:r>
+              <w:rPr>
+                <w:b w:val="0"/>
+                <w:sz w:val="17"/>
+              </w:rPr>
+              <w:t>Every stage change time-stamped and attributed</w:t>
+            </w:r>
+          </w:p>
+        </w:tc>
+        <w:tc>
+          <w:tcPr>
+            <w:tcW w:type="dxa" w:w="2304"/>
+          </w:tcPr>
+          <w:p>
+            <w:pPr>
+              <w:spacing w:after="20"/>
+            </w:pPr>
+            <w:r/>
+            <w:r>
+              <w:rPr>
+                <w:b w:val="0"/>
+                <w:sz w:val="17"/>
+              </w:rPr>
+              <w:t>A merged duplicate keeps both histories (FR-22)</w:t>
+            </w:r>
+          </w:p>
+        </w:tc>
+        <w:tc>
+          <w:tcPr>
+            <w:tcW w:type="dxa" w:w="2304"/>
+          </w:tcPr>
+          <w:p>
+            <w:pPr>
+              <w:spacing w:after="20"/>
+            </w:pPr>
+            <w:r/>
+            <w:r>
+              <w:rPr>
+                <w:b w:val="0"/>
+                <w:sz w:val="17"/>
+              </w:rPr>
+              <w:t>Coordinator alerted to a possible duplicate (Proposed)</w:t>
+            </w:r>
+          </w:p>
+        </w:tc>
+      </w:tr>
+      <w:tr>
+        <w:trPr>
+          <w:cantSplit/>
+        </w:trPr>
+        <w:tc>
+          <w:tcPr>
+            <w:tcW w:type="dxa" w:w="2304"/>
+            <w:shd w:val="clear" w:fill="DCE6F2"/>
+          </w:tcPr>
+          <w:p>
+            <w:pPr>
+              <w:spacing w:after="20"/>
+            </w:pPr>
+            <w:r/>
+            <w:r>
+              <w:rPr>
+                <w:b/>
+                <w:sz w:val="17"/>
+              </w:rPr>
+              <w:t>Store to Use</w:t>
+            </w:r>
+          </w:p>
+          <w:p>
+            <w:pPr>
+              <w:spacing w:after="20"/>
+            </w:pPr>
+            <w:r>
+              <w:rPr>
+                <w:b/>
+                <w:sz w:val="17"/>
+              </w:rPr>
+              <w:t>record read by views</w:t>
+            </w:r>
+          </w:p>
+        </w:tc>
+        <w:tc>
+          <w:tcPr>
+            <w:tcW w:type="dxa" w:w="2304"/>
+          </w:tcPr>
+          <w:p>
+            <w:pPr>
+              <w:spacing w:after="20"/>
+            </w:pPr>
+            <w:r/>
+            <w:r>
+              <w:rPr>
+                <w:b w:val="0"/>
+                <w:sz w:val="17"/>
+              </w:rPr>
+              <w:t>Role-based access to every view (FR-25, NFR-14 to NFR-16); exact permissions to confirm</w:t>
+            </w:r>
+          </w:p>
+        </w:tc>
+        <w:tc>
+          <w:tcPr>
+            <w:tcW w:type="dxa" w:w="2304"/>
+          </w:tcPr>
+          <w:p>
+            <w:pPr>
+              <w:spacing w:after="20"/>
+            </w:pPr>
+            <w:r/>
+            <w:r>
+              <w:rPr>
+                <w:b w:val="0"/>
+                <w:sz w:val="17"/>
+              </w:rPr>
+              <w:t>Views read the clean record only (silver)</w:t>
+            </w:r>
+          </w:p>
+        </w:tc>
+        <w:tc>
+          <w:tcPr>
+            <w:tcW w:type="dxa" w:w="2304"/>
+          </w:tcPr>
+          <w:p>
+            <w:pPr>
+              <w:spacing w:after="20"/>
+            </w:pPr>
+            <w:r/>
+            <w:r>
+              <w:rPr>
+                <w:b w:val="0"/>
+                <w:sz w:val="17"/>
+              </w:rPr>
+              <w:t>A request with no stage change is flagged (time threshold to define)</w:t>
+            </w:r>
+          </w:p>
+        </w:tc>
+        <w:tc>
+          <w:tcPr>
+            <w:tcW w:type="dxa" w:w="2304"/>
+          </w:tcPr>
+          <w:p>
+            <w:pPr>
+              <w:spacing w:after="20"/>
+            </w:pPr>
+            <w:r/>
+            <w:r>
+              <w:rPr>
+                <w:b w:val="0"/>
+                <w:sz w:val="17"/>
+              </w:rPr>
+              <w:t>A failed update or upload is retried and the user is told (Proposed)</w:t>
+            </w:r>
+          </w:p>
+        </w:tc>
+        <w:tc>
+          <w:tcPr>
+            <w:tcW w:type="dxa" w:w="2304"/>
+          </w:tcPr>
+          <w:p>
+            <w:pPr>
+              <w:spacing w:after="20"/>
+            </w:pPr>
+            <w:r/>
+            <w:r>
+              <w:rPr>
+                <w:b w:val="0"/>
+                <w:sz w:val="17"/>
+              </w:rPr>
+              <w:t>Stalled request visible to the coordinator (Proposed)</w:t>
+            </w:r>
+          </w:p>
+        </w:tc>
+      </w:tr>
+      <w:tr>
+        <w:trPr>
+          <w:cantSplit/>
+        </w:trPr>
+        <w:tc>
+          <w:tcPr>
+            <w:tcW w:type="dxa" w:w="2304"/>
+            <w:shd w:val="clear" w:fill="DCE6F2"/>
+          </w:tcPr>
+          <w:p>
+            <w:pPr>
+              <w:spacing w:after="20"/>
+            </w:pPr>
+            <w:r/>
+            <w:r>
+              <w:rPr>
+                <w:b/>
+                <w:sz w:val="17"/>
+              </w:rPr>
+              <w:t>Use to the sinks</w:t>
+            </w:r>
+          </w:p>
+          <w:p>
+            <w:pPr>
+              <w:spacing w:after="20"/>
+            </w:pPr>
+            <w:r>
+              <w:rPr>
+                <w:b/>
+                <w:sz w:val="17"/>
+              </w:rPr>
+              <w:t>views, measures, reports</w:t>
+            </w:r>
+          </w:p>
+        </w:tc>
+        <w:tc>
+          <w:tcPr>
+            <w:tcW w:type="dxa" w:w="2304"/>
+          </w:tcPr>
+          <w:p>
+            <w:pPr>
+              <w:spacing w:after="20"/>
+            </w:pPr>
+            <w:r/>
+            <w:r>
+              <w:rPr>
+                <w:b w:val="0"/>
+                <w:sz w:val="17"/>
+              </w:rPr>
+              <w:t>Reports aggregated and role-restricted; external requester gets a read-only status link (client)</w:t>
+            </w:r>
+          </w:p>
+        </w:tc>
+        <w:tc>
+          <w:tcPr>
+            <w:tcW w:type="dxa" w:w="2304"/>
+          </w:tcPr>
+          <w:p>
+            <w:pPr>
+              <w:spacing w:after="20"/>
+            </w:pPr>
+            <w:r/>
+            <w:r>
+              <w:rPr>
+                <w:b w:val="0"/>
+                <w:sz w:val="17"/>
+              </w:rPr>
+              <w:t>Report figures traceable back to the record</w:t>
+            </w:r>
+          </w:p>
+        </w:tc>
+        <w:tc>
+          <w:tcPr>
+            <w:tcW w:type="dxa" w:w="2304"/>
+          </w:tcPr>
+          <w:p>
+            <w:pPr>
+              <w:spacing w:after="20"/>
+            </w:pPr>
+            <w:r/>
+            <w:r>
+              <w:rPr>
+                <w:b w:val="0"/>
+                <w:sz w:val="17"/>
+              </w:rPr>
+              <w:t>Report freshness on a set period (to confirm)</w:t>
+            </w:r>
+          </w:p>
+        </w:tc>
+        <w:tc>
+          <w:tcPr>
+            <w:tcW w:type="dxa" w:w="2304"/>
+          </w:tcPr>
+          <w:p>
+            <w:pPr>
+              <w:spacing w:after="20"/>
+            </w:pPr>
+            <w:r/>
+            <w:r>
+              <w:rPr>
+                <w:b w:val="0"/>
+                <w:sz w:val="17"/>
+              </w:rPr>
+              <w:t>Retention per the Government of Alberta records schedule (NFR-17)</w:t>
+            </w:r>
+          </w:p>
+        </w:tc>
+        <w:tc>
+          <w:tcPr>
+            <w:tcW w:type="dxa" w:w="2304"/>
+          </w:tcPr>
+          <w:p>
+            <w:pPr>
+              <w:spacing w:after="20"/>
+            </w:pPr>
+            <w:r/>
+            <w:r>
+              <w:rPr>
+                <w:b w:val="0"/>
+                <w:sz w:val="17"/>
+              </w:rPr>
+              <w:t>Unanswered Action Required notifies the requester; email preferred (client)</w:t>
+            </w:r>
+          </w:p>
+        </w:tc>
+      </w:tr>
+    </w:tbl>
+    <w:p>
+      <w:pPr>
+        <w:spacing w:after="40"/>
+      </w:pPr>
+    </w:p>
+    <w:p>
+      <w:pPr>
+        <w:keepNext/>
+        <w:spacing w:before="200"/>
+      </w:pPr>
+      <w:r>
+        <w:rPr>
+          <w:b/>
+          <w:sz w:val="26"/>
+        </w:rPr>
+        <w:t>5. Cleaning requirements: what "clean" means for PRISM Furniture Request</w:t>
       </w:r>
     </w:p>
     <w:p>
@@ -5983,7 +6883,7 @@
           <w:b/>
           <w:sz w:val="26"/>
         </w:rPr>
-        <w:t>5. Session Three and Four stage questions, answered for our product</w:t>
+        <w:t>6. Session Three and Four stage questions, answered for our product</w:t>
       </w:r>
     </w:p>
     <w:tbl>
@@ -6400,7 +7300,7 @@
                 <w:b w:val="0"/>
                 <w:sz w:val="19"/>
               </w:rPr>
-              <w:t>Today nobody would notice; the CMAC chases. With control F, a request with no stage change becomes visible (time threshold to define).</w:t>
+              <w:t>Today nobody would notice; the CMAC chases. With monitoring at the hand-offs, a request with no stage change becomes visible (time threshold to define).</w:t>
             </w:r>
           </w:p>
         </w:tc>
@@ -6459,7 +7359,7 @@
                 <w:b w:val="0"/>
                 <w:sz w:val="19"/>
               </w:rPr>
-              <w:t>Rules 1 to 6 in section 4, each with its failure path.</w:t>
+              <w:t>Rules 1 to 6 in section 5, each with its failure path.</w:t>
             </w:r>
           </w:p>
         </w:tc>
@@ -6577,7 +7477,7 @@
                 <w:b w:val="0"/>
                 <w:sz w:val="19"/>
               </w:rPr>
-              <w:t>CMACs: own requests, updated at every stage change. Coordinators: their queue, current. Management: aggregates on a set period (to confirm).</w:t>
+              <w:t>CMACs: their requests (exact permissions to confirm), updated at every stage change. Coordinators: their queue, current. Management: aggregates on a set period (to confirm).</w:t>
             </w:r>
           </w:p>
         </w:tc>
@@ -6657,7 +7557,7 @@
           <w:b/>
           <w:sz w:val="26"/>
         </w:rPr>
-        <w:t>6. My slide content and speaker notes (deck slides 5 and 6)</w:t>
+        <w:t>7. My slide content and speaker notes (deck slides 5 and 6)</w:t>
       </w:r>
     </w:p>
     <w:p>
@@ -6674,7 +7574,7 @@
           <w:i w:val="0"/>
           <w:sz w:val="23"/>
         </w:rPr>
-        <w:t>Slide 5. Five stages from source to sink, with the controls on the hand-offs</w:t>
+        <w:t>Slide 5. Five stages from source to sink, and what moves between them</w:t>
       </w:r>
       <w:r>
         <w:rPr>
@@ -6693,7 +7593,7 @@
         <w:rPr>
           <w:b w:val="0"/>
         </w:rPr>
-        <w:t>Image of the Miro pipeline: scope boundary, five stages with owners, controls A V F M S on the connectors, three kinds of sink, the loop</w:t>
+        <w:t>Image of the Miro pipeline: scope boundary; five stages, each showing who enters the data and who is accountable; labels on the arrows for the data that moves; three kinds of sink; the loop</w:t>
       </w:r>
     </w:p>
     <w:p>
@@ -6730,7 +7630,7 @@
           <w:i w:val="0"/>
           <w:sz w:val="21"/>
         </w:rPr>
-        <w:t xml:space="preserve"> This is our pipeline model in Miro, built with the Session Four conceptual template. The scope boundary is on top, each of the five stages shows who enters the data and who is accountable for its accuracy, three kinds of sink are on the right, and the loop is underneath. Nodes do the work; connectors carry the controls. A, authenticate: only an authorized requester may submit. V, validate: required fields are checked and an incomplete request goes back to the requester. F, monitor: every stage change carries a time. M, mitigate: a failed update is retried and the user is told. S, alarm: an unanswered Action Required notifies the requester. All five are proposed until the client confirms. The audit trail is bronze, the product reads silver, and management reports read gold.</w:t>
+        <w:t xml:space="preserve"> This is our pipeline model in Miro, built with the Session Four conceptual template. The scope boundary is on top, each of the five stages shows who enters the data and who is accountable for its accuracy, three kinds of sink are on the right, and the loop is underneath. The labels on the arrows show what moves: the need into Collect, the submitted request and attachments into Keep and Shape, the clean, linked request into Store, the record with its history into Use, and status, events and aggregates into the sinks. Nodes do the work and connectors carry the controls, but as Session Four says, all five questions are asked at every hand-off: who may move the data, is it acceptable, would we know if it stopped, what happens if it fails, and who is told. The board's governance grid shows how each applies. Items not in our requirements are proposed until the client confirms. The audit trail is bronze, the product reads silver, and management reports read gold.</w:t>
       </w:r>
     </w:p>
     <w:p>
@@ -6766,7 +7666,7 @@
         <w:rPr>
           <w:b w:val="0"/>
         </w:rPr>
-        <w:t>Five hops down the slide (need is born, request is entered, checked and shaped, stored as one record, read by the product), each showing what moves, who enters it and who is accountable; controls A, V, F, M between the hops</w:t>
+        <w:t>Five hops down the slide (need is born, request is entered, checked and shaped, stored as one record, read by the product), each showing what moves, who enters it and who is accountable; between the hops, a label for the data passed on</w:t>
       </w:r>
     </w:p>
     <w:p>
@@ -6790,7 +7690,7 @@
         <w:rPr>
           <w:b w:val="0"/>
         </w:rPr>
-        <w:t>Bottom line: constraints (frequency, format, access, retention, scope)</w:t>
+        <w:t>Bottom line: governance (all five considerations at every hand-off, not one per arrow) and constraints, with the CMAC access rule marked Proposed</w:t>
       </w:r>
     </w:p>
     <w:p>
@@ -6828,7 +7728,7 @@
           <w:b/>
           <w:sz w:val="26"/>
         </w:rPr>
-        <w:t>7. Validation and actions (Working 2: 20 min validate, 10 min actions)</w:t>
+        <w:t>8. Validation and actions (Working 2: 20 min validate, 10 min actions)</w:t>
       </w:r>
     </w:p>
     <w:tbl>
@@ -7650,6 +8550,101 @@
                 <w:sz w:val="19"/>
               </w:rPr>
               <w:t>CMAC for submitted details; PRISM Core owner to be named</w:t>
+            </w:r>
+          </w:p>
+        </w:tc>
+        <w:tc>
+          <w:tcPr>
+            <w:tcW w:type="dxa" w:w="2880"/>
+          </w:tcPr>
+          <w:p>
+            <w:pPr>
+              <w:spacing w:after="20"/>
+            </w:pPr>
+            <w:r/>
+            <w:r>
+              <w:rPr>
+                <w:b w:val="0"/>
+                <w:sz w:val="19"/>
+              </w:rPr>
+              <w:t>Client</w:t>
+            </w:r>
+          </w:p>
+        </w:tc>
+        <w:tc>
+          <w:tcPr>
+            <w:tcW w:type="dxa" w:w="2448"/>
+          </w:tcPr>
+          <w:p>
+            <w:pPr>
+              <w:spacing w:after="20"/>
+            </w:pPr>
+            <w:r/>
+            <w:r>
+              <w:rPr>
+                <w:b w:val="0"/>
+                <w:sz w:val="19"/>
+              </w:rPr>
+              <w:t>Admin 3, 29 Oct</w:t>
+            </w:r>
+          </w:p>
+        </w:tc>
+      </w:tr>
+      <w:tr>
+        <w:trPr>
+          <w:cantSplit/>
+        </w:trPr>
+        <w:tc>
+          <w:tcPr>
+            <w:tcW w:type="dxa" w:w="432"/>
+          </w:tcPr>
+          <w:p>
+            <w:pPr>
+              <w:spacing w:after="20"/>
+            </w:pPr>
+            <w:r/>
+            <w:r>
+              <w:rPr>
+                <w:b/>
+                <w:sz w:val="19"/>
+              </w:rPr>
+              <w:t>9</w:t>
+            </w:r>
+          </w:p>
+        </w:tc>
+        <w:tc>
+          <w:tcPr>
+            <w:tcW w:type="dxa" w:w="3744"/>
+          </w:tcPr>
+          <w:p>
+            <w:pPr>
+              <w:spacing w:after="20"/>
+            </w:pPr>
+            <w:r/>
+            <w:r>
+              <w:rPr>
+                <w:b w:val="0"/>
+                <w:sz w:val="19"/>
+              </w:rPr>
+              <w:t>Exact CMAC view permissions</w:t>
+            </w:r>
+          </w:p>
+        </w:tc>
+        <w:tc>
+          <w:tcPr>
+            <w:tcW w:type="dxa" w:w="4320"/>
+          </w:tcPr>
+          <w:p>
+            <w:pPr>
+              <w:spacing w:after="20"/>
+            </w:pPr>
+            <w:r/>
+            <w:r>
+              <w:rPr>
+                <w:b w:val="0"/>
+                <w:sz w:val="19"/>
+              </w:rPr>
+              <w:t>Proposed: a CMAC sees only their own requests (or the ministry's, to confirm)</w:t>
             </w:r>
           </w:p>
         </w:tc>

</xml_diff>

<commit_message>
Align Data Pipeline deck and Ade deliverables with the consolidated Working 2 Miro frame
Miro part references now point to the single frame (Parts A to E); lineage
paths drop the old governance letters.

Co-Authored-By: Claude Opus 5.5 <noreply@anthropic.com>
Claude-Session: https://claude.ai/code/session_01XD5hCTym2561nrmEJXnbUU
</commit_message>
<xml_diff>
--- a/MDPM 830/Data Pipeline/Ade_Deliverables_Pipeline_Stages_and_Data_Ownership.docx
+++ b/MDPM 830/Data Pipeline/Ade_Deliverables_Pipeline_Stages_and_Data_Ownership.docx
@@ -247,7 +247,7 @@
                 <w:b w:val="0"/>
                 <w:sz w:val="19"/>
               </w:rPr>
-              <w:t>Miro frame "Working 2: Pipeline Stages and Data Ownership", Part A</w:t>
+              <w:t>Miro frame "Working 2: Pipeline Stages and Data Ownership", Part A (stage cards)</w:t>
             </w:r>
           </w:p>
         </w:tc>
@@ -342,7 +342,7 @@
                 <w:b w:val="0"/>
                 <w:sz w:val="19"/>
               </w:rPr>
-              <w:t>Same frame, owner tags and Part B table</w:t>
+              <w:t>Same frame, Part A: Who enters / who is accountable card on each stage</w:t>
             </w:r>
           </w:p>
         </w:tc>
@@ -437,7 +437,7 @@
                 <w:b w:val="0"/>
                 <w:sz w:val="19"/>
               </w:rPr>
-              <w:t>Same frame, Part C; section 5 below</w:t>
+              <w:t>Same frame, Part A: Preparation card on each stage; section 5 below</w:t>
             </w:r>
           </w:p>
         </w:tc>
@@ -532,7 +532,7 @@
                 <w:b w:val="0"/>
                 <w:sz w:val="19"/>
               </w:rPr>
-              <w:t>Same frame, Part B; section 2 below</w:t>
+              <w:t>Same frame, Part A: Constraints card on each stage; section 2 below</w:t>
             </w:r>
           </w:p>
         </w:tc>
@@ -627,7 +627,7 @@
                 <w:b w:val="0"/>
                 <w:sz w:val="19"/>
               </w:rPr>
-              <w:t>Miro Part G; section 4 below</w:t>
+              <w:t>Same frame, Part B; section 4 below</w:t>
             </w:r>
           </w:p>
         </w:tc>
@@ -722,7 +722,7 @@
                 <w:b w:val="0"/>
                 <w:sz w:val="19"/>
               </w:rPr>
-              <w:t>Same frame; the earlier draft frame is integrated as Part H</w:t>
+              <w:t>Same frame, Parts A to E (one consolidated frame)</w:t>
             </w:r>
           </w:p>
         </w:tc>
@@ -1102,7 +1102,7 @@
                 <w:b w:val="0"/>
                 <w:sz w:val="19"/>
               </w:rPr>
-              <w:t>Miro Parts A and B; sections 2 and 3 below</w:t>
+              <w:t>Same frame, Parts A and C; sections 2 and 3 below</w:t>
             </w:r>
           </w:p>
         </w:tc>
@@ -1197,7 +1197,7 @@
                 <w:b w:val="0"/>
                 <w:sz w:val="19"/>
               </w:rPr>
-              <w:t>Miro Parts E and F; section 3 below; deck slide 6</w:t>
+              <w:t>Same frame, Part C; section 3 below; deck slide 6</w:t>
             </w:r>
           </w:p>
         </w:tc>
@@ -4325,7 +4325,7 @@
                 <w:b w:val="0"/>
                 <w:sz w:val="18"/>
               </w:rPr>
-              <w:t>Collect, V, Keep and Shape, Store</w:t>
+              <w:t>Collect, Keep and Shape, Store</w:t>
             </w:r>
           </w:p>
         </w:tc>
@@ -4551,7 +4551,7 @@
                 <w:b w:val="0"/>
                 <w:sz w:val="18"/>
               </w:rPr>
-              <w:t>Collect, V, Store</w:t>
+              <w:t>Collect, Store</w:t>
             </w:r>
           </w:p>
         </w:tc>
@@ -4777,7 +4777,7 @@
                 <w:b w:val="0"/>
                 <w:sz w:val="18"/>
               </w:rPr>
-              <w:t>Collect, V (type sets attachments and lead time), Store</w:t>
+              <w:t>Collect (type sets attachments and lead time), Store</w:t>
             </w:r>
           </w:p>
         </w:tc>
@@ -4890,7 +4890,7 @@
                 <w:b w:val="0"/>
                 <w:sz w:val="18"/>
               </w:rPr>
-              <w:t>Collect, V, Store</w:t>
+              <w:t>Collect, Store</w:t>
             </w:r>
           </w:p>
         </w:tc>
@@ -5003,7 +5003,7 @@
                 <w:b w:val="0"/>
                 <w:sz w:val="18"/>
               </w:rPr>
-              <w:t>Keep and Shape, F, Store</w:t>
+              <w:t>Keep and Shape, Store</w:t>
             </w:r>
           </w:p>
         </w:tc>
@@ -5473,7 +5473,7 @@
                 <w:b w:val="0"/>
                 <w:sz w:val="18"/>
               </w:rPr>
-              <w:t>Measurement; alarm</w:t>
+              <w:t>Measurement; Action Required alarm</w:t>
             </w:r>
           </w:p>
         </w:tc>

</xml_diff>